<commit_message>
Divide material de setembro em cronograma geral + PDFs de material por semana
Cronograma geral (docx/pdf) fica só com o consultivo para nós, referenciando o PDF de material a anexar nas semanas 1 e 2. Cada PDF de material (Autoconceito, Autoimagem) vira arquivo próprio, pronto para enviar ao grupo junto com o texto, com o bloco "Hora de Exercitar" inteiro numa única página.

Co-Authored-By: Claude Sonnet 5 <noreply@anthropic.com>
Claude-Session: https://claude.ai/code/session_01WSt3GY1qD8uPk293jNa2cE
</commit_message>
<xml_diff>
--- a/camila-sartori/materiais-grupo-vip/setembro-comunidade.docx
+++ b/camila-sartori/materiais-grupo-vip/setembro-comunidade.docx
@@ -423,143 +423,25 @@
     </w:p>
     <w:p>
       <w:pPr>
-        <w:spacing w:before="200" w:after="60"/>
+        <w:spacing w:after="200"/>
+        <w:shd w:val="clear" w:fill="F2E6F7"/>
       </w:pPr>
       <w:r>
         <w:rPr>
           <w:b/>
           <w:i w:val="0"/>
-          <w:color w:val="9C1256"/>
-          <w:sz w:val="23"/>
-        </w:rPr>
-        <w:t>AUTOCONCEITO: o que você pensa de você</w:t>
-      </w:r>
-    </w:p>
-    <w:p>
-      <w:pPr>
-        <w:spacing w:after="200"/>
-        <w:shd w:val="clear" w:fill="FBEEF7"/>
-      </w:pPr>
-      <w:r>
-        <w:rPr>
-          <w:b w:val="0"/>
-          <w:i/>
-          <w:color w:val="6B4B60"/>
+          <w:color w:val="5A1042"/>
           <w:sz w:val="19"/>
         </w:rPr>
-        <w:t>Lá no nosso primeiro material, sobre insegurança emocional, a gente falou sobre a origem das nossas inseguranças e sobre os pensamentos que passam pela sua cabeça em momentos difíceis. Se você fez aquele exercício, vale voltar e reler agora: muitos daqueles pensamentos são, na prática, o seu autoconceito se manifestando.</w:t>
+        <w:t xml:space="preserve">📎 Material de apoio (PDF em arquivo separado): </w:t>
       </w:r>
-    </w:p>
-    <w:p>
-      <w:pPr>
-        <w:spacing w:after="160"/>
-      </w:pPr>
       <w:r>
         <w:rPr>
           <w:b w:val="0"/>
           <w:i w:val="0"/>
-          <w:sz w:val="20"/>
+          <w:sz w:val="19"/>
         </w:rPr>
-        <w:t>O autoconceito é o conjunto de crenças que você tem sobre si mesma. Não é fato, é interpretação, construída ao longo da vida, moldável, e muitas vezes distorcida.</w:t>
-      </w:r>
-    </w:p>
-    <w:p>
-      <w:pPr>
-        <w:spacing w:before="200" w:after="60"/>
-      </w:pPr>
-      <w:r>
-        <w:rPr>
-          <w:b/>
-          <w:i w:val="0"/>
-          <w:color w:val="9C1256"/>
-          <w:sz w:val="23"/>
-        </w:rPr>
-        <w:t>Como a autocrítica vira um problema</w:t>
-      </w:r>
-    </w:p>
-    <w:p>
-      <w:pPr>
-        <w:spacing w:after="160"/>
-      </w:pPr>
-      <w:r>
-        <w:rPr>
-          <w:b w:val="0"/>
-          <w:i w:val="0"/>
-          <w:sz w:val="20"/>
-        </w:rPr>
-        <w:t>Existe diferença entre autocrítica construtiva, pontual, sobre o que você fez, e autocrítica cruel, generalizada, sobre quem você é. "Eu me enganei nessa conta" é diferente de "eu sou burra". Uma corrige, a outra machuca sem construir nada.</w:t>
-      </w:r>
-    </w:p>
-    <w:p>
-      <w:pPr>
-        <w:spacing w:before="200" w:after="60"/>
-      </w:pPr>
-      <w:r>
-        <w:rPr>
-          <w:b/>
-          <w:i w:val="0"/>
-          <w:color w:val="9C1256"/>
-          <w:sz w:val="23"/>
-        </w:rPr>
-        <w:t>A armadilha da autorrotulação</w:t>
-      </w:r>
-    </w:p>
-    <w:p>
-      <w:pPr>
-        <w:spacing w:after="160"/>
-      </w:pPr>
-      <w:r>
-        <w:rPr>
-          <w:b w:val="0"/>
-          <w:i w:val="0"/>
-          <w:sz w:val="20"/>
-        </w:rPr>
-        <w:t>Trocar "eu me comportei mal" por "eu sou má" parece pequeno, mas muda tudo. Rótulos fixos, sempre, nunca, tudo, nada, não deixam espaço pra exceção, e você é cheia de exceções.</w:t>
-      </w:r>
-    </w:p>
-    <w:p>
-      <w:pPr>
-        <w:spacing w:before="200" w:after="60"/>
-      </w:pPr>
-      <w:r>
-        <w:rPr>
-          <w:b/>
-          <w:i w:val="0"/>
-          <w:color w:val="9C1256"/>
-          <w:sz w:val="23"/>
-        </w:rPr>
-        <w:t>Tudo ou nada</w:t>
-      </w:r>
-    </w:p>
-    <w:p>
-      <w:pPr>
-        <w:spacing w:after="160"/>
-      </w:pPr>
-      <w:r>
-        <w:rPr>
-          <w:b w:val="0"/>
-          <w:i w:val="0"/>
-          <w:sz w:val="20"/>
-        </w:rPr>
-        <w:t>Se você pensa em "sucesso ou fracasso", sem meio-termo, toda conquista parcial vira invisível. A vida real é feita de aproximações, não de extremos.</w:t>
-      </w:r>
-    </w:p>
-    <w:p>
-      <w:pPr>
-        <w:spacing w:after="240"/>
-        <w:shd w:val="clear" w:fill="FBEEF7"/>
-      </w:pPr>
-      <w:r>
-        <w:rPr>
-          <w:b/>
-          <w:i w:val="0"/>
-          <w:color w:val="9C1256"/>
-          <w:sz w:val="22"/>
-        </w:rPr>
-        <w:t>Hora de Exercitar</w:t>
-      </w:r>
-      <w:r>
-        <w:br/>
+        <w:t xml:space="preserve">pegar o conteúdo do arquivo </w:t>
       </w:r>
       <w:r>
         <w:rPr>
@@ -567,94 +449,15 @@
           <w:i w:val="0"/>
           <w:sz w:val="19"/>
         </w:rPr>
-        <w:t>Anote os pensamentos que passam pela sua cabeça quando você se sente insegura ou erra alguma coisa:</w:t>
-      </w:r>
-      <w:r>
-        <w:br/>
+        <w:t>Setembro · Semana 1 · Autoconceito.pdf</w:t>
       </w:r>
       <w:r>
         <w:rPr>
           <w:b w:val="0"/>
           <w:i w:val="0"/>
-          <w:color w:val="E0B8D6"/>
           <w:sz w:val="19"/>
         </w:rPr>
-        <w:t>______________________________________________________________________</w:t>
-      </w:r>
-      <w:r>
-        <w:br/>
-      </w:r>
-      <w:r>
-        <w:rPr>
-          <w:b w:val="0"/>
-          <w:i w:val="0"/>
-          <w:color w:val="E0B8D6"/>
-          <w:sz w:val="19"/>
-        </w:rPr>
-        <w:t>______________________________________________________________________</w:t>
-      </w:r>
-      <w:r>
-        <w:br/>
-      </w:r>
-      <w:r>
-        <w:rPr>
-          <w:b w:val="0"/>
-          <w:i w:val="0"/>
-          <w:color w:val="E0B8D6"/>
-          <w:sz w:val="19"/>
-        </w:rPr>
-        <w:t>______________________________________________________________________</w:t>
-      </w:r>
-      <w:r>
-        <w:br/>
-      </w:r>
-      <w:r>
-        <w:rPr>
-          <w:b/>
-          <w:i w:val="0"/>
-          <w:sz w:val="19"/>
-        </w:rPr>
-        <w:t>Agora releia: esses pensamentos falam sobre uma conduta específica, ou viraram um rótulo sobre quem você é?</w:t>
-      </w:r>
-      <w:r>
-        <w:br/>
-      </w:r>
-      <w:r>
-        <w:rPr>
-          <w:b w:val="0"/>
-          <w:i w:val="0"/>
-          <w:color w:val="E0B8D6"/>
-          <w:sz w:val="19"/>
-        </w:rPr>
-        <w:t>______________________________________________________________________</w:t>
-      </w:r>
-      <w:r>
-        <w:br/>
-      </w:r>
-      <w:r>
-        <w:rPr>
-          <w:b w:val="0"/>
-          <w:i w:val="0"/>
-          <w:color w:val="E0B8D6"/>
-          <w:sz w:val="19"/>
-        </w:rPr>
-        <w:t>______________________________________________________________________</w:t>
-      </w:r>
-    </w:p>
-    <w:p>
-      <w:pPr>
-        <w:spacing w:before="160" w:after="200"/>
-        <w:jc w:val="center"/>
-        <w:shd w:val="clear" w:fill="9C1256"/>
-      </w:pPr>
-      <w:r>
-        <w:rPr>
-          <w:b/>
-          <w:i w:val="0"/>
-          <w:color w:val="FFFFFF"/>
-          <w:sz w:val="21"/>
-        </w:rPr>
-        <w:t>"Eu me comportei de um jeito que não gostei" é diferente de "eu sou assim". Você não é seu pior dia.</w:t>
+        <w:t xml:space="preserve"> para enviar junto com o texto acima.</w:t>
       </w:r>
     </w:p>
     <w:p>
@@ -824,116 +627,25 @@
     </w:p>
     <w:p>
       <w:pPr>
-        <w:spacing w:before="200" w:after="60"/>
+        <w:spacing w:after="200"/>
+        <w:shd w:val="clear" w:fill="F2E6F7"/>
       </w:pPr>
       <w:r>
         <w:rPr>
           <w:b/>
           <w:i w:val="0"/>
-          <w:color w:val="9C1256"/>
-          <w:sz w:val="23"/>
-        </w:rPr>
-        <w:t>AUTOIMAGEM: a relação com o seu corpo</w:t>
-      </w:r>
-    </w:p>
-    <w:p>
-      <w:pPr>
-        <w:spacing w:after="200"/>
-        <w:shd w:val="clear" w:fill="FBEEF7"/>
-      </w:pPr>
-      <w:r>
-        <w:rPr>
-          <w:b w:val="0"/>
-          <w:i/>
-          <w:color w:val="6B4B60"/>
+          <w:color w:val="5A1042"/>
           <w:sz w:val="19"/>
         </w:rPr>
-        <w:t>Lembra do nosso material sobre insegurança emocional? A gente falou sobre o medo de não ser aceita. Muitas vezes esse medo mora, especificamente, na forma como enxergamos nosso próprio corpo. Vamos aprofundar esse ponto agora.</w:t>
+        <w:t xml:space="preserve">📎 Material de apoio (PDF em arquivo separado): </w:t>
       </w:r>
-    </w:p>
-    <w:p>
-      <w:pPr>
-        <w:spacing w:after="160"/>
-      </w:pPr>
       <w:r>
         <w:rPr>
           <w:b w:val="0"/>
           <w:i w:val="0"/>
-          <w:sz w:val="20"/>
+          <w:sz w:val="19"/>
         </w:rPr>
-        <w:t>Não existe critério universal de beleza, ele muda de época, de cultura, de família. O padrão que você aprendeu a usar como régua foi construído, não é verdade absoluta.</w:t>
-      </w:r>
-    </w:p>
-    <w:p>
-      <w:pPr>
-        <w:spacing w:before="200" w:after="60"/>
-      </w:pPr>
-      <w:r>
-        <w:rPr>
-          <w:b/>
-          <w:i w:val="0"/>
-          <w:color w:val="9C1256"/>
-          <w:sz w:val="23"/>
-        </w:rPr>
-        <w:t>A lupa pessoal</w:t>
-      </w:r>
-    </w:p>
-    <w:p>
-      <w:pPr>
-        <w:spacing w:after="160"/>
-      </w:pPr>
-      <w:r>
-        <w:rPr>
-          <w:b w:val="0"/>
-          <w:i w:val="0"/>
-          <w:sz w:val="20"/>
-        </w:rPr>
-        <w:t>A mente tem o hábito de aumentar o que a incomoda em você e apagar o resto. Um "defeito" pequeno vira, na sua cabeça, a única coisa que existe no espelho.</w:t>
-      </w:r>
-    </w:p>
-    <w:p>
-      <w:pPr>
-        <w:spacing w:before="200" w:after="60"/>
-      </w:pPr>
-      <w:r>
-        <w:rPr>
-          <w:b/>
-          <w:i w:val="0"/>
-          <w:color w:val="9C1256"/>
-          <w:sz w:val="23"/>
-        </w:rPr>
-        <w:t>O peso da comparação</w:t>
-      </w:r>
-    </w:p>
-    <w:p>
-      <w:pPr>
-        <w:spacing w:after="160"/>
-      </w:pPr>
-      <w:r>
-        <w:rPr>
-          <w:b w:val="0"/>
-          <w:i w:val="0"/>
-          <w:sz w:val="20"/>
-        </w:rPr>
-        <w:t>Comparar-se com padrões inatingíveis, redes sociais, filtros, edições, é uma comparação injusta desde o início, você está competindo com uma versão que nem é real.</w:t>
-      </w:r>
-    </w:p>
-    <w:p>
-      <w:pPr>
-        <w:spacing w:after="240"/>
-        <w:shd w:val="clear" w:fill="FBEEF7"/>
-      </w:pPr>
-      <w:r>
-        <w:rPr>
-          <w:b/>
-          <w:i w:val="0"/>
-          <w:color w:val="9C1256"/>
-          <w:sz w:val="22"/>
-        </w:rPr>
-        <w:t>Hora de Exercitar</w:t>
-      </w:r>
-      <w:r>
-        <w:br/>
+        <w:t xml:space="preserve">pegar o conteúdo do arquivo </w:t>
       </w:r>
       <w:r>
         <w:rPr>
@@ -941,94 +653,15 @@
           <w:i w:val="0"/>
           <w:sz w:val="19"/>
         </w:rPr>
-        <w:t>Escreva 3 coisas do seu corpo que você geralmente não repara, mas que fazem parte de você:</w:t>
-      </w:r>
-      <w:r>
-        <w:br/>
+        <w:t>Setembro · Semana 2 · Autoimagem.pdf</w:t>
       </w:r>
       <w:r>
         <w:rPr>
           <w:b w:val="0"/>
           <w:i w:val="0"/>
-          <w:color w:val="E0B8D6"/>
           <w:sz w:val="19"/>
         </w:rPr>
-        <w:t>______________________________________________________________________</w:t>
-      </w:r>
-      <w:r>
-        <w:br/>
-      </w:r>
-      <w:r>
-        <w:rPr>
-          <w:b w:val="0"/>
-          <w:i w:val="0"/>
-          <w:color w:val="E0B8D6"/>
-          <w:sz w:val="19"/>
-        </w:rPr>
-        <w:t>______________________________________________________________________</w:t>
-      </w:r>
-      <w:r>
-        <w:br/>
-      </w:r>
-      <w:r>
-        <w:rPr>
-          <w:b w:val="0"/>
-          <w:i w:val="0"/>
-          <w:color w:val="E0B8D6"/>
-          <w:sz w:val="19"/>
-        </w:rPr>
-        <w:t>______________________________________________________________________</w:t>
-      </w:r>
-      <w:r>
-        <w:br/>
-      </w:r>
-      <w:r>
-        <w:rPr>
-          <w:b/>
-          <w:i w:val="0"/>
-          <w:sz w:val="19"/>
-        </w:rPr>
-        <w:t>Agora escreva: o que você diria pra uma amiga que falasse de si mesma do jeito que você fala do seu próprio corpo?</w:t>
-      </w:r>
-      <w:r>
-        <w:br/>
-      </w:r>
-      <w:r>
-        <w:rPr>
-          <w:b w:val="0"/>
-          <w:i w:val="0"/>
-          <w:color w:val="E0B8D6"/>
-          <w:sz w:val="19"/>
-        </w:rPr>
-        <w:t>______________________________________________________________________</w:t>
-      </w:r>
-      <w:r>
-        <w:br/>
-      </w:r>
-      <w:r>
-        <w:rPr>
-          <w:b w:val="0"/>
-          <w:i w:val="0"/>
-          <w:color w:val="E0B8D6"/>
-          <w:sz w:val="19"/>
-        </w:rPr>
-        <w:t>______________________________________________________________________</w:t>
-      </w:r>
-    </w:p>
-    <w:p>
-      <w:pPr>
-        <w:spacing w:before="160" w:after="200"/>
-        <w:jc w:val="center"/>
-        <w:shd w:val="clear" w:fill="9C1256"/>
-      </w:pPr>
-      <w:r>
-        <w:rPr>
-          <w:b/>
-          <w:i w:val="0"/>
-          <w:color w:val="FFFFFF"/>
-          <w:sz w:val="21"/>
-        </w:rPr>
-        <w:t>Você não precisa achar seu corpo perfeito pra tratá-lo com respeito.</w:t>
+        <w:t xml:space="preserve"> para enviar junto com o texto acima.</w:t>
       </w:r>
     </w:p>
     <w:p>

</xml_diff>

<commit_message>
Ajusta fechamentos, texto do resumão e material de setembro
Plano B da Semana 3 protegido contra corte de página; fechamentos das mensagens de WhatsApp não repetem mais "mulheres donas de si"; texto de dúvidas incorporado ao corpo do resumão do mês; PDFs de material das semanas 1 e 2 mostram só o nome da temática, sem "Semana X" e data.

Co-Authored-By: Claude Sonnet 5 <noreply@anthropic.com>
Claude-Session: https://claude.ai/code/session_01WSt3GY1qD8uPk293jNa2cE
</commit_message>
<xml_diff>
--- a/camila-sartori/materiais-grupo-vip/setembro-comunidade.docx
+++ b/camila-sartori/materiais-grupo-vip/setembro-comunidade.docx
@@ -418,7 +418,7 @@
           <w:i w:val="0"/>
           <w:sz w:val="20"/>
         </w:rPr>
-        <w:t>Boa leitura, mulheres donas de si! 💕</w:t>
+        <w:t>Boa leitura! 💕</w:t>
       </w:r>
     </w:p>
     <w:p>
@@ -622,7 +622,7 @@
           <w:i w:val="0"/>
           <w:sz w:val="20"/>
         </w:rPr>
-        <w:t>Bom exercício, mulheres donas de si! 💕</w:t>
+        <w:t>Bom exercício! 💕</w:t>
       </w:r>
     </w:p>
     <w:p>
@@ -826,7 +826,7 @@
           <w:i w:val="0"/>
           <w:sz w:val="20"/>
         </w:rPr>
-        <w:t>Boa reflexão, mulheres donas de si! 💕</w:t>
+        <w:t>Boa reflexão! 💕</w:t>
       </w:r>
     </w:p>
     <w:p>
@@ -1074,7 +1074,7 @@
           <w:i w:val="0"/>
           <w:sz w:val="20"/>
         </w:rPr>
-        <w:t>Boa reflexão, mulheres donas de si! 💕</w:t>
+        <w:t>Boa reflexão! 💕</w:t>
       </w:r>
     </w:p>
     <w:p>
@@ -1332,7 +1332,18 @@
           <w:i w:val="0"/>
           <w:sz w:val="20"/>
         </w:rPr>
-        <w:t>Ótimo mês pra todas nós, mulheres donas de si! 💕</w:t>
+        <w:t>Se você tiver qualquer dúvida ou quiser saber mais detalhes sobre a Comunidade AME-SE, sobre terapia particular comigo ou sobre esse grupo, me chama no privado.</w:t>
+      </w:r>
+      <w:r>
+        <w:br/>
+      </w:r>
+      <w:r>
+        <w:rPr>
+          <w:b w:val="0"/>
+          <w:i w:val="0"/>
+          <w:sz w:val="20"/>
+        </w:rPr>
+        <w:t>Ótimo mês pra todas nós! 💕</w:t>
       </w:r>
     </w:p>
     <w:p>
@@ -1340,18 +1351,6 @@
         <w:spacing w:before="280"/>
         <w:jc w:val="center"/>
       </w:pPr>
-      <w:r>
-        <w:rPr>
-          <w:b w:val="0"/>
-          <w:i w:val="0"/>
-          <w:color w:val="6B4B60"/>
-          <w:sz w:val="16"/>
-        </w:rPr>
-        <w:t>Se você tiver qualquer dúvida ou quiser saber mais detalhes sobre a Comunidade AME-SE, sobre terapia particular comigo ou sobre esse grupo, me chama no privado.</w:t>
-      </w:r>
-      <w:r>
-        <w:br/>
-      </w:r>
       <w:r>
         <w:rPr>
           <w:b/>

</xml_diff>

<commit_message>
Adiciona link da Comunidade AME-SE no texto do resumão de setembro
Co-Authored-By: Claude Sonnet 5 <noreply@anthropic.com>
Claude-Session: https://claude.ai/code/session_01WSt3GY1qD8uPk293jNa2cE
</commit_message>
<xml_diff>
--- a/camila-sartori/materiais-grupo-vip/setembro-comunidade.docx
+++ b/camila-sartori/materiais-grupo-vip/setembro-comunidade.docx
@@ -1321,7 +1321,18 @@
           <w:i w:val="0"/>
           <w:sz w:val="20"/>
         </w:rPr>
-        <w:t>Lembrando que todo esse material, junto com vídeos e conteúdos ainda mais aprofundados sobre esses temas, está disponível de forma organizada e completa dentro da Comunidade AME-SE, lá dá pra estudar no seu ritmo, sem precisar procurar entre as conversas do grupo.</w:t>
+        <w:t>Lembrando que todo esse material, junto com vídeos e conteúdos ainda mais aprofundados sobre esses temas, está disponível de forma organizada e completa dentro da Comunidade AME-SE, lá dá pra estudar no seu ritmo, sem precisar procurar entre as conversas do grupo. Se você quiser saber mais, clique no link 👇</w:t>
+      </w:r>
+      <w:r>
+        <w:br/>
+      </w:r>
+      <w:r>
+        <w:rPr>
+          <w:b w:val="0"/>
+          <w:i w:val="0"/>
+          <w:sz w:val="20"/>
+        </w:rPr>
+        <w:t>🔗 curso-ame-se.camilasartori.com.br</w:t>
       </w:r>
       <w:r>
         <w:br/>

</xml_diff>